<commit_message>
Personnalise les courriers ATLI Worldwide et CIE-SODECI, complète les exports PDF des packs
- ATLI Worldwide : courrier adressé à Monsieur Benoît Bindè Bindè, Directeur Général
- CIE-SODECI : fusionne les 2 courriers séparés en un seul, adressé à Monsieur Gnamian N'Guetta Abdoulaye, Directeur Production Informatique
- Ajoute les exports PDF manquants pour AHK CI, BNI, Pigier CI, Port Autonome San Pedro
- Ajoute une version alternative de la Charte IA (script Python) dans outputs/

Co-Authored-By: Claude Sonnet 5 <noreply@anthropic.com>
</commit_message>
<xml_diff>
--- a/docs/transferai-prospection/packs-entreprises-cibles-2026-07/AHK_CI/Courrier_AHK_CI_2026-07-07.docx
+++ b/docs/transferai-prospection/packs-entreprises-cibles-2026-07/AHK_CI/Courrier_AHK_CI_2026-07-07.docx
@@ -238,7 +238,7 @@
           <w:b/>
           <w:bCs/>
         </w:rPr>
-        <w:t xml:space="preserve">Soulemane Konate</w:t>
+        <w:t xml:space="preserve">Casimir Kassi Beda</w:t>
       </w:r>
     </w:p>
     <w:p>
@@ -246,7 +246,7 @@
         <w:spacing w:after="40"/>
       </w:pPr>
       <w:r>
-        <w:t xml:space="preserve">Directeur IA &amp; Innovation — TransferAI Africa</w:t>
+        <w:t xml:space="preserve">Directeur Général — Nettelecom CI x TransferAI Africa</w:t>
       </w:r>
     </w:p>
     <w:p>

</xml_diff>